<commit_message>
Väv in väghållar-argument i kollektiva yttrandet (p7 + p10)
Eftersom samfällighetsföreningen för Lygnersvider ga:1 sannolikt inte hinner
skicka in eget yttrande integreras nyckelargumenten direkt i det kollektiva:

Punkt 7 (Trafikutredning):
- Behovet av åtgärder och underhåll utanför planområdet
- Vårdpersonal tillagt i nyttotrafik-listan
- Nytt avsnitt om finansieringsansvar: exploateringsavtal enligt 5 kap. 13 § PBL,
  hänvisning till punkt 10 och principen att den som genererar kostnad bör bära den

Punkt 10 (Lygnersvider ga:1):
- Strukturerad lista med tre konsekvenser (andelstal, slitage, administrativ börda)
- Utvecklad 6 a § AL-text om att skyddsreglerna riskerar sättas ur spel
- Ny yrkandpunkt om kostnadsansvar via exploateringsavtal (korsreferens till p7)
</commit_message>
<xml_diff>
--- a/yttranden/yttrande_kollektivt.docx
+++ b/yttranden/yttrande_kollektivt.docx
@@ -2617,7 +2617,7 @@
         </w:numPr>
       </w:pPr>
       <w:r>
-        <w:t xml:space="preserve">Beräkningen av ÅDT inkluderar inte etablerings- och byggtrafik under en upp till tioårig genomförandetid eller tillkommande nyttotrafik (post, paket, sophämtning, varuleveranser, hemtjänst).</w:t>
+        <w:t xml:space="preserve">Beräkningen av ÅDT inkluderar inte etablerings- och byggtrafik under en upp till tioårig genomförandetid eller tillkommande nyttotrafik (post, paket, sophämtning, varuleveranser, hemtjänst, vårdpersonal).</w:t>
       </w:r>
     </w:p>
     <w:p>
@@ -2629,6 +2629,28 @@
         </w:numPr>
       </w:pPr>
       <w:r>
+        <w:rPr>
+          <w:b/>
+          <w:bCs/>
+        </w:rPr>
+        <w:t xml:space="preserve">Behovet av åtgärder och underhåll utanför planområdet</w:t>
+      </w:r>
+      <w:r>
+        <w:t xml:space="preserve"> </w:t>
+      </w:r>
+      <w:r>
+        <w:t xml:space="preserve">är inte adresserat. Jägmästarvägen förvaltas av den lokala samfällighetsföreningen (Lygnersvider ga:1) som ensam ansvarar för väghållningen söder om planområdet. Den ökade trafiken kommer slita på sträckor som inte uppgraderas men trafikeras väsentligt mer, utan att finansiella resurser tilldelats för uppgradering.</w:t>
+      </w:r>
+    </w:p>
+    <w:p>
+      <w:pPr>
+        <w:pStyle w:val="Compact"/>
+        <w:numPr>
+          <w:ilvl w:val="0"/>
+          <w:numId w:val="1008"/>
+        </w:numPr>
+      </w:pPr>
+      <w:r>
         <w:t xml:space="preserve">Ingen gång- och cykelväg planeras inom eller anslutande till området, trots LIS-tilläggets uttryckliga rekommendation om att GC-väg ska anordnas mellan bebyggelse och strandområde (LIS sid. 19).</w:t>
       </w:r>
     </w:p>
@@ -2684,6 +2706,40 @@
       </w:pPr>
       <w:r>
         <w:t xml:space="preserve">Vi yrkar att trafikutredningen kompletteras med dagsfärska mätningar, prognos vid full utbyggnad inkl. byggtrafik, säkerhetsanalys för oskyddade trafikanter, samt konkreta trafiksäkerhetshöjande åtgärder (sänkt hastighet, GC-bana, belysning) som bindande planbestämmelser.</w:t>
+      </w:r>
+    </w:p>
+    <w:p>
+      <w:pPr>
+        <w:pStyle w:val="BodyText"/>
+      </w:pPr>
+      <w:r>
+        <w:rPr>
+          <w:b/>
+          <w:bCs/>
+        </w:rPr>
+        <w:t xml:space="preserve">Finansieringsansvar:</w:t>
+      </w:r>
+      <w:r>
+        <w:t xml:space="preserve"> </w:t>
+      </w:r>
+      <w:r>
+        <w:t xml:space="preserve">Det är en grundläggande planprincip att den som genererar en kostnad bör bära den. Den ökade trafiken, eventuella förstärkningsåtgärder och de ökade underhållskostnaderna är direkta följder av exploateringen och bör inte ensidigt belasta befintliga delägare i samfällighetsföreningen för Lygnersvider ga:1 (se vidare punkt 10). Vi yrkar att frågan om</w:t>
+      </w:r>
+      <w:r>
+        <w:t xml:space="preserve"> </w:t>
+      </w:r>
+      <w:r>
+        <w:rPr>
+          <w:b/>
+          <w:bCs/>
+        </w:rPr>
+        <w:t xml:space="preserve">kostnadsansvar för utbyggnad och underhåll av Jägmästarvägen regleras i exploateringsavtal</w:t>
+      </w:r>
+      <w:r>
+        <w:t xml:space="preserve"> </w:t>
+      </w:r>
+      <w:r>
+        <w:t xml:space="preserve">mellan kommunen och exploatören enligt 5 kap. 13 § PBL, och att exploateringsavtalet redovisas inför granskningsskedet.</w:t>
       </w:r>
     </w:p>
     <w:bookmarkEnd w:id="24"/>
@@ -3091,7 +3147,81 @@
         <w:pStyle w:val="FirstParagraph"/>
       </w:pPr>
       <w:r>
-        <w:t xml:space="preserve">Jägmästarvägen förvaltas av en lokal samfällighetsförening genom gemensamhetsanläggningen Lygnersvider ga:1. Anslutning av ca 30 nya fastigheter ändrar andelstal och kostnadsfördelning för samtliga nuvarande delägare väsentligt. Anslutning prövas av Lantmäteriet enligt anläggningslagen 42 a och 43 §§.</w:t>
+        <w:t xml:space="preserve">Jägmästarvägen förvaltas av en lokal samfällighetsförening genom gemensamhetsanläggningen Lygnersvider ga:1. Anslutning av ca 30 nya fastigheter påverkar samtliga nuvarande delägare väsentligt:</w:t>
+      </w:r>
+    </w:p>
+    <w:p>
+      <w:pPr>
+        <w:pStyle w:val="Compact"/>
+        <w:numPr>
+          <w:ilvl w:val="0"/>
+          <w:numId w:val="1011"/>
+        </w:numPr>
+      </w:pPr>
+      <w:r>
+        <w:rPr>
+          <w:b/>
+          <w:bCs/>
+        </w:rPr>
+        <w:t xml:space="preserve">Andelstal och kostnadsfördelning</w:t>
+      </w:r>
+      <w:r>
+        <w:t xml:space="preserve"> </w:t>
+      </w:r>
+      <w:r>
+        <w:t xml:space="preserve">ändras – samtliga befintliga delägare påverkas av att nya andelar tillkommer och av hur Lantmäteriet sätter andelstalen för de nya fastigheterna. Anslutning prövas av Lantmäteriet enligt anläggningslagen 42 a och 43 §§.</w:t>
+      </w:r>
+    </w:p>
+    <w:p>
+      <w:pPr>
+        <w:pStyle w:val="Compact"/>
+        <w:numPr>
+          <w:ilvl w:val="0"/>
+          <w:numId w:val="1011"/>
+        </w:numPr>
+      </w:pPr>
+      <w:r>
+        <w:rPr>
+          <w:b/>
+          <w:bCs/>
+        </w:rPr>
+        <w:t xml:space="preserve">Slitage och underhållsbörda</w:t>
+      </w:r>
+      <w:r>
+        <w:t xml:space="preserve"> </w:t>
+      </w:r>
+      <w:r>
+        <w:t xml:space="preserve">ökar – särskilt på den del av Jägmästarvägen söder om planområdet som inte uppgraderas men trafikeras väsentligt mer. Kostnaden för anläggningens kapacitetshöjning, slitage och underhåll under och efter genomförandetiden ligger på sträckor och anläggningar som föreningen och dess delägare förvaltar (se även punkt 7 om finansieringsansvar).</w:t>
+      </w:r>
+    </w:p>
+    <w:p>
+      <w:pPr>
+        <w:pStyle w:val="Compact"/>
+        <w:numPr>
+          <w:ilvl w:val="0"/>
+          <w:numId w:val="1011"/>
+        </w:numPr>
+      </w:pPr>
+      <w:r>
+        <w:rPr>
+          <w:b/>
+          <w:bCs/>
+        </w:rPr>
+        <w:t xml:space="preserve">Föreningens administrativa börda</w:t>
+      </w:r>
+      <w:r>
+        <w:t xml:space="preserve"> </w:t>
+      </w:r>
+      <w:r>
+        <w:t xml:space="preserve">ökar – införlivande av ett betydande antal nya delägare medför arbete med uppdatering av andelstal, debitering, stämmoförvaltning och eventuell omprövning av anläggningsbeslut.</w:t>
+      </w:r>
+    </w:p>
+    <w:p>
+      <w:pPr>
+        <w:pStyle w:val="FirstParagraph"/>
+      </w:pPr>
+      <w:r>
+        <w:t xml:space="preserve">De skyddsregler för deltagande fastigheter som följer av 5 och 6 §§ AL kan enligt 6 a § AL undantas om detaljplanen innehåller en bestämmelse om gemensamhetsanläggning och Lantmäteriets beslut fattas under planens genomförandetid. Det innebär att de normala skyddsreglerna för befintliga delägare riskerar att sättas ur spel av planen själv. Konsekvenserna för befintliga delägare måste därför redovisas och utredas redan i planhandlingarna, inte hänvisas till en senare lantmäteriförrättning där skyddsreglerna inte längre gäller.</w:t>
       </w:r>
     </w:p>
     <w:p>
@@ -3099,14 +3229,6 @@
         <w:pStyle w:val="BodyText"/>
       </w:pPr>
       <w:r>
-        <w:t xml:space="preserve">De skyddsregler för deltagande fastigheter som följer av 5 och 6 §§ AL kan enligt 6 a § AL undantas om detaljplanen innehåller en bestämmelse om gemensamhetsanläggning och Lantmäteriets beslut fattas under planens genomförandetid. Eftersom dessa skyddsregler då kan falla bort måste konsekvenserna för befintliga delägare i Lygnersvider ga:1 redovisas redan i planhandlingarna.</w:t>
-      </w:r>
-    </w:p>
-    <w:p>
-      <w:pPr>
-        <w:pStyle w:val="BodyText"/>
-      </w:pPr>
-      <w:r>
         <w:t xml:space="preserve">Vi begär:</w:t>
       </w:r>
     </w:p>
@@ -3115,7 +3237,7 @@
         <w:pStyle w:val="Compact"/>
         <w:numPr>
           <w:ilvl w:val="0"/>
-          <w:numId w:val="1011"/>
+          <w:numId w:val="1012"/>
         </w:numPr>
       </w:pPr>
       <w:r>
@@ -3127,7 +3249,7 @@
         <w:pStyle w:val="Compact"/>
         <w:numPr>
           <w:ilvl w:val="0"/>
-          <w:numId w:val="1011"/>
+          <w:numId w:val="1012"/>
         </w:numPr>
       </w:pPr>
       <w:r>
@@ -3139,11 +3261,39 @@
         <w:pStyle w:val="Compact"/>
         <w:numPr>
           <w:ilvl w:val="0"/>
-          <w:numId w:val="1011"/>
+          <w:numId w:val="1012"/>
         </w:numPr>
       </w:pPr>
       <w:r>
         <w:t xml:space="preserve">Att planbeskrivningen omformuleras så att den korrekt återger att frågan om servitutens fortsatta giltighet och om GA-anslutning prövas av Lantmäteriet, inte i planprocessen.</w:t>
+      </w:r>
+    </w:p>
+    <w:p>
+      <w:pPr>
+        <w:pStyle w:val="Compact"/>
+        <w:numPr>
+          <w:ilvl w:val="0"/>
+          <w:numId w:val="1012"/>
+        </w:numPr>
+      </w:pPr>
+      <w:r>
+        <w:t xml:space="preserve">Att</w:t>
+      </w:r>
+      <w:r>
+        <w:t xml:space="preserve"> </w:t>
+      </w:r>
+      <w:r>
+        <w:rPr>
+          <w:b/>
+          <w:bCs/>
+        </w:rPr>
+        <w:t xml:space="preserve">kostnadsansvar för utbyggnad och underhåll av Jägmästarvägen regleras i exploateringsavtal</w:t>
+      </w:r>
+      <w:r>
+        <w:t xml:space="preserve"> </w:t>
+      </w:r>
+      <w:r>
+        <w:t xml:space="preserve">mellan kommunen och exploatören enligt 5 kap. 13 § PBL (se punkt 7), så att ekonomiska konsekvenser av exploateringen inte ensidigt belastar befintliga delägare i föreningen.</w:t>
       </w:r>
     </w:p>
     <w:bookmarkEnd w:id="30"/>
@@ -3169,7 +3319,7 @@
         <w:pStyle w:val="Compact"/>
         <w:numPr>
           <w:ilvl w:val="0"/>
-          <w:numId w:val="1012"/>
+          <w:numId w:val="1013"/>
         </w:numPr>
       </w:pPr>
       <w:r>
@@ -3181,7 +3331,7 @@
         <w:pStyle w:val="Compact"/>
         <w:numPr>
           <w:ilvl w:val="0"/>
-          <w:numId w:val="1012"/>
+          <w:numId w:val="1013"/>
         </w:numPr>
       </w:pPr>
       <w:r>
@@ -3193,7 +3343,7 @@
         <w:pStyle w:val="Compact"/>
         <w:numPr>
           <w:ilvl w:val="0"/>
-          <w:numId w:val="1012"/>
+          <w:numId w:val="1013"/>
         </w:numPr>
       </w:pPr>
       <w:r>
@@ -3205,7 +3355,7 @@
         <w:pStyle w:val="Compact"/>
         <w:numPr>
           <w:ilvl w:val="0"/>
-          <w:numId w:val="1012"/>
+          <w:numId w:val="1013"/>
         </w:numPr>
       </w:pPr>
       <w:r>
@@ -3217,7 +3367,7 @@
         <w:pStyle w:val="Compact"/>
         <w:numPr>
           <w:ilvl w:val="0"/>
-          <w:numId w:val="1012"/>
+          <w:numId w:val="1013"/>
         </w:numPr>
       </w:pPr>
       <w:r>
@@ -3247,7 +3397,7 @@
         <w:pStyle w:val="Compact"/>
         <w:numPr>
           <w:ilvl w:val="0"/>
-          <w:numId w:val="1013"/>
+          <w:numId w:val="1014"/>
         </w:numPr>
       </w:pPr>
       <w:r>
@@ -3269,7 +3419,7 @@
         <w:pStyle w:val="Compact"/>
         <w:numPr>
           <w:ilvl w:val="0"/>
-          <w:numId w:val="1013"/>
+          <w:numId w:val="1014"/>
         </w:numPr>
       </w:pPr>
       <w:r>
@@ -3307,7 +3457,7 @@
         <w:pStyle w:val="Compact"/>
         <w:numPr>
           <w:ilvl w:val="0"/>
-          <w:numId w:val="1013"/>
+          <w:numId w:val="1014"/>
         </w:numPr>
       </w:pPr>
       <w:r>
@@ -3329,7 +3479,7 @@
         <w:pStyle w:val="Compact"/>
         <w:numPr>
           <w:ilvl w:val="0"/>
-          <w:numId w:val="1013"/>
+          <w:numId w:val="1014"/>
         </w:numPr>
       </w:pPr>
       <w:r>
@@ -3367,7 +3517,7 @@
         <w:pStyle w:val="Compact"/>
         <w:numPr>
           <w:ilvl w:val="0"/>
-          <w:numId w:val="1013"/>
+          <w:numId w:val="1014"/>
         </w:numPr>
       </w:pPr>
       <w:r>
@@ -3417,7 +3567,7 @@
         <w:pStyle w:val="Compact"/>
         <w:numPr>
           <w:ilvl w:val="0"/>
-          <w:numId w:val="1014"/>
+          <w:numId w:val="1015"/>
         </w:numPr>
       </w:pPr>
       <w:r>
@@ -3429,7 +3579,7 @@
         <w:pStyle w:val="Compact"/>
         <w:numPr>
           <w:ilvl w:val="0"/>
-          <w:numId w:val="1014"/>
+          <w:numId w:val="1015"/>
         </w:numPr>
       </w:pPr>
       <w:r>
@@ -3441,7 +3591,7 @@
         <w:pStyle w:val="Compact"/>
         <w:numPr>
           <w:ilvl w:val="0"/>
-          <w:numId w:val="1014"/>
+          <w:numId w:val="1015"/>
         </w:numPr>
       </w:pPr>
       <w:r>
@@ -3453,7 +3603,7 @@
         <w:pStyle w:val="Compact"/>
         <w:numPr>
           <w:ilvl w:val="0"/>
-          <w:numId w:val="1014"/>
+          <w:numId w:val="1015"/>
         </w:numPr>
       </w:pPr>
       <w:r>
@@ -3475,7 +3625,7 @@
         <w:pStyle w:val="Compact"/>
         <w:numPr>
           <w:ilvl w:val="0"/>
-          <w:numId w:val="1015"/>
+          <w:numId w:val="1016"/>
         </w:numPr>
       </w:pPr>
       <w:r>
@@ -3487,7 +3637,7 @@
         <w:pStyle w:val="Compact"/>
         <w:numPr>
           <w:ilvl w:val="0"/>
-          <w:numId w:val="1015"/>
+          <w:numId w:val="1016"/>
         </w:numPr>
       </w:pPr>
       <w:r>
@@ -3499,7 +3649,7 @@
         <w:pStyle w:val="Compact"/>
         <w:numPr>
           <w:ilvl w:val="0"/>
-          <w:numId w:val="1015"/>
+          <w:numId w:val="1016"/>
         </w:numPr>
       </w:pPr>
       <w:r>
@@ -3521,7 +3671,7 @@
         <w:pStyle w:val="Compact"/>
         <w:numPr>
           <w:ilvl w:val="0"/>
-          <w:numId w:val="1016"/>
+          <w:numId w:val="1017"/>
         </w:numPr>
       </w:pPr>
       <w:r>
@@ -3533,7 +3683,7 @@
         <w:pStyle w:val="Compact"/>
         <w:numPr>
           <w:ilvl w:val="0"/>
-          <w:numId w:val="1016"/>
+          <w:numId w:val="1017"/>
         </w:numPr>
       </w:pPr>
       <w:r>
@@ -3555,7 +3705,7 @@
         <w:pStyle w:val="Compact"/>
         <w:numPr>
           <w:ilvl w:val="0"/>
-          <w:numId w:val="1017"/>
+          <w:numId w:val="1018"/>
         </w:numPr>
       </w:pPr>
       <w:r>
@@ -3567,7 +3717,7 @@
         <w:pStyle w:val="Compact"/>
         <w:numPr>
           <w:ilvl w:val="0"/>
-          <w:numId w:val="1017"/>
+          <w:numId w:val="1018"/>
         </w:numPr>
       </w:pPr>
       <w:r>
@@ -3579,7 +3729,7 @@
         <w:pStyle w:val="Compact"/>
         <w:numPr>
           <w:ilvl w:val="0"/>
-          <w:numId w:val="1017"/>
+          <w:numId w:val="1018"/>
         </w:numPr>
       </w:pPr>
       <w:r>
@@ -4052,6 +4202,9 @@
     <w:abstractNumId w:val="991"/>
   </w:num>
   <w:num w:numId="1017">
+    <w:abstractNumId w:val="991"/>
+  </w:num>
+  <w:num w:numId="1018">
     <w:abstractNumId w:val="991"/>
   </w:num>
 </w:numbering>

</xml_diff>

<commit_message>
Översikt: 4 huvudgrunder, LIS-småskalighet först
Översiktslistan ändrad från sex till fyra tunga materiella miljörättsliga
grunder. LIS-småskalighet flyttas till första position (högsta prio):

1. Bristande anpassning till områdets karaktär / LIS-småskalighet
2. Artskyddet är inte säkrat (med MÖD 2023:17 II tillagt)
3. Strandskyddsupphävandet är otillräckligt motiverat
4. MKN för vatten

Tidigare punkt 5 (officialservitut) och 6 (planförfarande) flyttas till
'Därutöver'-stycket med övriga formella och fastighetsrättsliga brister.
Cleaner inledning, tydligare prioritetssignalering.
</commit_message>
<xml_diff>
--- a/yttranden/yttrande_kollektivt.docx
+++ b/yttranden/yttrande_kollektivt.docx
@@ -246,7 +246,7 @@
         <w:pStyle w:val="FirstParagraph"/>
       </w:pPr>
       <w:r>
-        <w:t xml:space="preserve">Detta yttrande gör gällande att planen i nuvarande form bör omarbetas väsentligt eller inte antas, primärt på följande sex tunga grunder:</w:t>
+        <w:t xml:space="preserve">Detta yttrande gör gällande att planen i nuvarande form bör omarbetas väsentligt eller inte antas, primärt på följande fyra tunga materiella miljörättsliga grunder:</w:t>
       </w:r>
     </w:p>
     <w:p>
@@ -262,13 +262,48 @@
           <w:b/>
           <w:bCs/>
         </w:rPr>
+        <w:t xml:space="preserve">Bristande anpassning till områdets karaktär och avvikelse från LIS-tilläggets krav på småskalighet</w:t>
+      </w:r>
+      <w:r>
+        <w:t xml:space="preserve"> </w:t>
+      </w:r>
+      <w:r>
+        <w:t xml:space="preserve">– LIS-tillägget kräver uttryckligen för LIS 06B SJÖDAL att bebyggelsen</w:t>
+      </w:r>
+      <w:r>
+        <w:t xml:space="preserve"> </w:t>
+      </w:r>
+      <w:r>
+        <w:rPr>
+          <w:i/>
+          <w:iCs/>
+        </w:rPr>
+        <w:t xml:space="preserve">"bör utformas småskaligt och smälta in i omgivande natur och bebyggelse"</w:t>
+      </w:r>
+      <w:r>
+        <w:t xml:space="preserve">. Den föreslagna bebyggelsen med radhus, kedjehus och parhus i upp till två våningar uppfyller inte detta krav och strider mot 2 kap. 6 § första stycket 1 PBL. Marks kommun har dessutom under 2025 antagit detaljplaner i två andra LIS-områden (Vännåkra 2:81, Melltorp 1:31) där samma LIS-formulering tolkats som friliggande villor i 1–1,5 plan. Se punkt 8 nedan.</w:t>
+      </w:r>
+    </w:p>
+    <w:p>
+      <w:pPr>
+        <w:pStyle w:val="Compact"/>
+        <w:numPr>
+          <w:ilvl w:val="0"/>
+          <w:numId w:val="1001"/>
+        </w:numPr>
+      </w:pPr>
+      <w:r>
+        <w:rPr>
+          <w:b/>
+          <w:bCs/>
+        </w:rPr>
         <w:t xml:space="preserve">Artskyddet är inte säkrat och miljökonsekvensbeskrivning saknas</w:t>
       </w:r>
       <w:r>
         <w:t xml:space="preserve"> </w:t>
       </w:r>
       <w:r>
-        <w:t xml:space="preserve">– planområdet är typisk fladdermushabitat (bilaga IV Art- och habitatdirektivet) och inventering har inte genomförts. Stark analogi till MÖD 2017:49 (Vadstena) där en detaljplan upphävdes på grund av otillräcklig MKB-analys av fladdermöss. Se punkt 2 och 3 nedan.</w:t>
+        <w:t xml:space="preserve">– planområdet är typisk fladdermushabitat (bilaga IV Art- och habitatdirektivet) och inventering har inte genomförts. Stark analogi till MÖD 2017:49 (Vadstena) och MÖD 2023:17 II (Sölvesborg) där detaljplaner upphävdes på grund av otillräcklig fladdermusutredning. Se punkt 2 och 3 nedan.</w:t>
       </w:r>
     </w:p>
     <w:p>
@@ -317,89 +352,39 @@
     </w:p>
     <w:p>
       <w:pPr>
-        <w:pStyle w:val="Compact"/>
-        <w:numPr>
-          <w:ilvl w:val="0"/>
-          <w:numId w:val="1001"/>
-        </w:numPr>
-      </w:pPr>
-      <w:r>
-        <w:rPr>
-          <w:b/>
-          <w:bCs/>
-        </w:rPr>
-        <w:t xml:space="preserve">Bristande anpassning till områdets karaktär och avvikelse från LIS-tilläggets krav på småskalighet</w:t>
-      </w:r>
-      <w:r>
-        <w:t xml:space="preserve"> </w:t>
-      </w:r>
-      <w:r>
-        <w:t xml:space="preserve">– LIS-tillägget kräver uttryckligen för LIS 06B SJÖDAL att bebyggelsen</w:t>
-      </w:r>
-      <w:r>
-        <w:t xml:space="preserve"> </w:t>
-      </w:r>
-      <w:r>
-        <w:rPr>
-          <w:i/>
-          <w:iCs/>
-        </w:rPr>
-        <w:t xml:space="preserve">"bör utformas småskaligt och smälta in i omgivande natur och bebyggelse"</w:t>
-      </w:r>
-      <w:r>
-        <w:t xml:space="preserve">. Den föreslagna bebyggelsen med radhus, kedjehus och parhus i upp till två våningar uppfyller inte detta krav och strider mot 2 kap. 6 § första stycket 1 PBL. Se punkt 8 nedan.</w:t>
-      </w:r>
-    </w:p>
-    <w:p>
-      <w:pPr>
-        <w:pStyle w:val="Compact"/>
-        <w:numPr>
-          <w:ilvl w:val="0"/>
-          <w:numId w:val="1001"/>
-        </w:numPr>
-      </w:pPr>
-      <w:r>
-        <w:rPr>
-          <w:b/>
-          <w:bCs/>
-        </w:rPr>
-        <w:t xml:space="preserve">Planbeskrivningen är väsentligt ofullständig vad gäller officialservitut och fastighetsrättsliga konsekvenser</w:t>
-      </w:r>
-      <w:r>
-        <w:t xml:space="preserve"> </w:t>
-      </w:r>
-      <w:r>
-        <w:t xml:space="preserve">– brott mot 4 kap. 33 § PBL och föregriper Lantmäteriets prövning. Se punkt 11 nedan (med direkt anknytning till punkt 9 och 10).</w:t>
-      </w:r>
-    </w:p>
-    <w:p>
-      <w:pPr>
-        <w:pStyle w:val="Compact"/>
-        <w:numPr>
-          <w:ilvl w:val="0"/>
-          <w:numId w:val="1001"/>
-        </w:numPr>
-      </w:pPr>
-      <w:r>
-        <w:rPr>
-          <w:b/>
-          <w:bCs/>
-        </w:rPr>
-        <w:t xml:space="preserve">Felaktigt val av planförfarande – ett självständigt processuellt fel</w:t>
-      </w:r>
-      <w:r>
-        <w:t xml:space="preserve"> </w:t>
-      </w:r>
-      <w:r>
-        <w:t xml:space="preserve">– med hänsyn till de materiella grunder som anförs i punkterna 1–4 ovan och de fastighetsrättsliga konsekvenserna i punkterna 10–11 är planen av betydande intresse för allmänheten och kan antas medföra betydande miljöpåverkan. Standardförfarande är därmed inte tillämpligt enligt 5 kap. 7 § första stycket 2 och 3 PBL; planen borde ha hanterats med utökat förfarande. Se punkt 12 nedan.</w:t>
-      </w:r>
-    </w:p>
-    <w:p>
-      <w:pPr>
         <w:pStyle w:val="FirstParagraph"/>
       </w:pPr>
       <w:r>
-        <w:t xml:space="preserve">Därutöver framförs kompletterande grunder rörande dagvatten/skyfall (punkt 5), ras/skred (punkt 6), trafiksäkerhet (punkt 7), badplatsen (punkt 9) samt Lygnersvider ga:1 (punkt 10).</w:t>
+        <w:t xml:space="preserve">Därutöver framförs</w:t>
+      </w:r>
+      <w:r>
+        <w:t xml:space="preserve"> </w:t>
+      </w:r>
+      <w:r>
+        <w:rPr>
+          <w:b/>
+          <w:bCs/>
+        </w:rPr>
+        <w:t xml:space="preserve">kompletterande grunder</w:t>
+      </w:r>
+      <w:r>
+        <w:t xml:space="preserve"> </w:t>
+      </w:r>
+      <w:r>
+        <w:t xml:space="preserve">rörande dagvatten/skyfall (punkt 5), ras/skred (punkt 6), trafiksäkerhet (punkt 7) och badplatsen (punkt 9), samt</w:t>
+      </w:r>
+      <w:r>
+        <w:t xml:space="preserve"> </w:t>
+      </w:r>
+      <w:r>
+        <w:rPr>
+          <w:b/>
+          <w:bCs/>
+        </w:rPr>
+        <w:t xml:space="preserve">fastighetsrättsliga och formella brister</w:t>
+      </w:r>
+      <w:r>
+        <w:t xml:space="preserve">: ofullständig redovisning av officialservitut (punkt 11), Lygnersvider ga:1 (punkt 10) och felaktigt val av planförfarande (punkt 12).</w:t>
       </w:r>
     </w:p>
     <w:bookmarkEnd w:id="11"/>

</xml_diff>

<commit_message>
Ta bort Bilaga 1 (förteckning över undertecknande) - alla skickar in själva
Eftersom varje sakägare skickar in eget yttrande via mail och refererar till
det kollektiva som stödargument, behövs ingen samlad förteckning över
undertecknande som bilaga.

- Bilaga 1 (förteckning) borttagen från mallen
- Resterande bilagor renumrerade (1: skärmdump, 2: Länsstyrelse-yttrande)
- Avsändare-placeholder förenklad: '[Undertecknande fastighetsägare/sakägare]'
- personalize_yttrande.py: remove_bilaga_undertecknande() borttagen (inte längre behövd)
</commit_message>
<xml_diff>
--- a/yttranden/yttrande_kollektivt.docx
+++ b/yttranden/yttrande_kollektivt.docx
@@ -137,7 +137,7 @@
         <w:t xml:space="preserve"> </w:t>
       </w:r>
       <w:r>
-        <w:t xml:space="preserve">[Undertecknande fastighetsägare enligt bilagd förteckning]</w:t>
+        <w:t xml:space="preserve">[Undertecknande fastighetsägare/sakägare]</w:t>
       </w:r>
     </w:p>
     <w:p>
@@ -3793,19 +3793,13 @@
         <w:br/>
       </w:r>
       <w:r>
-        <w:t xml:space="preserve">Bilaga 1 – Förteckning över undertecknande fastighetsägare med fastighetsbeteckningar (samtliga räknas som enskilda sakägare enligt 5 kap. 11 § PBL).</w:t>
+        <w:t xml:space="preserve">Bilaga 1 – Skärmdump av kommunens projektsida 2026-05-18 (visande rubriken "HÅKANKILA 1:19", kan tillhandahållas vid begäran).</w:t>
       </w:r>
       <w:r>
         <w:br/>
       </w:r>
       <w:r>
-        <w:t xml:space="preserve">Bilaga 2 – Skärmdump av kommunens projektsida 2026-05-18 (visande rubriken "HÅKANKILA 1:19", kan tillhandahållas vid begäran).</w:t>
-      </w:r>
-      <w:r>
-        <w:br/>
-      </w:r>
-      <w:r>
-        <w:t xml:space="preserve">Bilaga 3 – Länsstyrelsens granskningsyttrande över FÖP Mark Nordväst, 2023-01-31, dnr 401-50227-2022 (åberopas i flera avsnitt ovan).</w:t>
+        <w:t xml:space="preserve">Bilaga 2 – Länsstyrelsens granskningsyttrande över FÖP Mark Nordväst, 2023-01-31, dnr 401-50227-2022 (åberopas i flera avsnitt ovan).</w:t>
       </w:r>
     </w:p>
     <w:bookmarkEnd w:id="37"/>

</xml_diff>

<commit_message>
Ta bort 'Sakägarinformation'-punkt (krav på fysiskt samrådsmöte)
Punkten begärde fysiskt samrådsmöte med handläggare och exploatör, alt.
förlängd samrådstid. Detta är överflödigt och kunde uppfattas som att vi
försöker fördröja processen. De viktiga argumenten finns i de andra
punkterna. Mjukare ton, bättre fokus.
</commit_message>
<xml_diff>
--- a/yttranden/yttrande_kollektivt.docx
+++ b/yttranden/yttrande_kollektivt.docx
@@ -2870,28 +2870,6 @@
       </w:r>
       <w:r>
         <w:t xml:space="preserve">Kommunen hanterar planen med standardförfarande. Enligt 5 kap. 7 § första stycket PBL får standardförfarande endast tillämpas om planförslaget bl.a. (p. 2) inte är av betydande intresse för allmänheten eller i övrigt av stor betydelse, och (p. 3) inte kan antas medföra en betydande miljöpåverkan. Med hänsyn till strandskyddsupphävandet (punkt 1), artskyddsfrågorna (punkt 2), MKB-frågan (punkt 3), MKN för vatten (punkt 4), de fastighetsrättsliga konsekvenserna för Lygnersvider ga:1 (punkt 10) samt de skyfalls- och översvämningsrisker som Länsstyrelsen redan flaggat i FÖP-skedet (punkt 5), gör vi gällande att förutsättningarna i 5 kap. 7 § första stycket 2 och 3 PBL inte är uppfyllda. Förfarandet borde därmed varit utökat. Vid utökat förfarande gäller skarpare krav på kungörelse, granskningstid och inhämtande av yttranden.</w:t>
-      </w:r>
-    </w:p>
-    <w:p>
-      <w:pPr>
-        <w:pStyle w:val="Compact"/>
-        <w:numPr>
-          <w:ilvl w:val="0"/>
-          <w:numId w:val="1014"/>
-        </w:numPr>
-      </w:pPr>
-      <w:r>
-        <w:rPr>
-          <w:b/>
-          <w:bCs/>
-        </w:rPr>
-        <w:t xml:space="preserve">Sakägarinformation.</w:t>
-      </w:r>
-      <w:r>
-        <w:t xml:space="preserve"> </w:t>
-      </w:r>
-      <w:r>
-        <w:t xml:space="preserve">Vi begär att samrådsmöte hålls fysiskt med kommunens handläggare och exploatör närvarande, alternativt att samrådstiden förlängs så att de oklarheter som denna skrivelse pekar ut kan ventileras innan granskning.</w:t>
       </w:r>
     </w:p>
     <w:bookmarkEnd w:id="32"/>

</xml_diff>